<commit_message>
Update report with Git Bash screenshots
</commit_message>
<xml_diff>
--- a/Лабораторная_работа_8_Отчет.docx
+++ b/Лабораторная_работа_8_Отчет.docx
@@ -454,7 +454,7 @@
       <w:r>
         <w:drawing>
           <wp:inline xmlns:a="http://schemas.openxmlformats.org/drawingml/2006/main" xmlns:pic="http://schemas.openxmlformats.org/drawingml/2006/picture">
-            <wp:extent cx="5940000" cy="3071829"/>
+            <wp:extent cx="5940000" cy="3386203"/>
             <wp:docPr id="1" name="Picture 1"/>
             <wp:cNvGraphicFramePr>
               <a:graphicFrameLocks noChangeAspect="1"/>
@@ -475,7 +475,7 @@
                   <pic:spPr>
                     <a:xfrm>
                       <a:off x="0" y="0"/>
-                      <a:ext cx="5940000" cy="3071829"/>
+                      <a:ext cx="5940000" cy="3386203"/>
                     </a:xfrm>
                     <a:prstGeom prst="rect"/>
                   </pic:spPr>
@@ -635,7 +635,7 @@
       <w:r>
         <w:drawing>
           <wp:inline xmlns:a="http://schemas.openxmlformats.org/drawingml/2006/main" xmlns:pic="http://schemas.openxmlformats.org/drawingml/2006/picture">
-            <wp:extent cx="5940000" cy="1018286"/>
+            <wp:extent cx="5940000" cy="2429472"/>
             <wp:docPr id="2" name="Picture 2"/>
             <wp:cNvGraphicFramePr>
               <a:graphicFrameLocks noChangeAspect="1"/>
@@ -656,7 +656,7 @@
                   <pic:spPr>
                     <a:xfrm>
                       <a:off x="0" y="0"/>
-                      <a:ext cx="5940000" cy="1018286"/>
+                      <a:ext cx="5940000" cy="2429472"/>
                     </a:xfrm>
                     <a:prstGeom prst="rect"/>
                   </pic:spPr>
@@ -791,7 +791,7 @@
       <w:r>
         <w:drawing>
           <wp:inline xmlns:a="http://schemas.openxmlformats.org/drawingml/2006/main" xmlns:pic="http://schemas.openxmlformats.org/drawingml/2006/picture">
-            <wp:extent cx="5940000" cy="2325086"/>
+            <wp:extent cx="5940000" cy="3617594"/>
             <wp:docPr id="3" name="Picture 3"/>
             <wp:cNvGraphicFramePr>
               <a:graphicFrameLocks noChangeAspect="1"/>
@@ -812,7 +812,7 @@
                   <pic:spPr>
                     <a:xfrm>
                       <a:off x="0" y="0"/>
-                      <a:ext cx="5940000" cy="2325086"/>
+                      <a:ext cx="5940000" cy="3617594"/>
                     </a:xfrm>
                     <a:prstGeom prst="rect"/>
                   </pic:spPr>
@@ -1345,7 +1345,7 @@
       <w:r>
         <w:drawing>
           <wp:inline xmlns:a="http://schemas.openxmlformats.org/drawingml/2006/main" xmlns:pic="http://schemas.openxmlformats.org/drawingml/2006/picture">
-            <wp:extent cx="5940000" cy="831600"/>
+            <wp:extent cx="5940000" cy="2429472"/>
             <wp:docPr id="4" name="Picture 4"/>
             <wp:cNvGraphicFramePr>
               <a:graphicFrameLocks noChangeAspect="1"/>
@@ -1366,7 +1366,7 @@
                   <pic:spPr>
                     <a:xfrm>
                       <a:off x="0" y="0"/>
-                      <a:ext cx="5940000" cy="831600"/>
+                      <a:ext cx="5940000" cy="2429472"/>
                     </a:xfrm>
                     <a:prstGeom prst="rect"/>
                   </pic:spPr>
@@ -2455,7 +2455,7 @@
       <w:r>
         <w:drawing>
           <wp:inline xmlns:a="http://schemas.openxmlformats.org/drawingml/2006/main" xmlns:pic="http://schemas.openxmlformats.org/drawingml/2006/picture">
-            <wp:extent cx="5940000" cy="3259756"/>
+            <wp:extent cx="5940000" cy="3124286"/>
             <wp:docPr id="5" name="Picture 5"/>
             <wp:cNvGraphicFramePr>
               <a:graphicFrameLocks noChangeAspect="1"/>
@@ -2476,7 +2476,7 @@
                   <pic:spPr>
                     <a:xfrm>
                       <a:off x="0" y="0"/>
-                      <a:ext cx="5940000" cy="3259756"/>
+                      <a:ext cx="5940000" cy="3124286"/>
                     </a:xfrm>
                     <a:prstGeom prst="rect"/>
                   </pic:spPr>
@@ -2595,7 +2595,7 @@
       <w:r>
         <w:drawing>
           <wp:inline xmlns:a="http://schemas.openxmlformats.org/drawingml/2006/main" xmlns:pic="http://schemas.openxmlformats.org/drawingml/2006/picture">
-            <wp:extent cx="5940000" cy="3259756"/>
+            <wp:extent cx="5940000" cy="3159918"/>
             <wp:docPr id="6" name="Picture 6"/>
             <wp:cNvGraphicFramePr>
               <a:graphicFrameLocks noChangeAspect="1"/>
@@ -2616,7 +2616,7 @@
                   <pic:spPr>
                     <a:xfrm>
                       <a:off x="0" y="0"/>
-                      <a:ext cx="5940000" cy="3259756"/>
+                      <a:ext cx="5940000" cy="3159918"/>
                     </a:xfrm>
                     <a:prstGeom prst="rect"/>
                   </pic:spPr>
@@ -3185,7 +3185,7 @@
       <w:r>
         <w:drawing>
           <wp:inline xmlns:a="http://schemas.openxmlformats.org/drawingml/2006/main" xmlns:pic="http://schemas.openxmlformats.org/drawingml/2006/picture">
-            <wp:extent cx="5940000" cy="7178914"/>
+            <wp:extent cx="5940000" cy="5284286"/>
             <wp:docPr id="7" name="Picture 7"/>
             <wp:cNvGraphicFramePr>
               <a:graphicFrameLocks noChangeAspect="1"/>
@@ -3194,7 +3194,7 @@
               <a:graphicData uri="http://schemas.openxmlformats.org/drawingml/2006/picture">
                 <pic:pic>
                   <pic:nvPicPr>
-                    <pic:cNvPr id="0" name="07_b3.png"/>
+                    <pic:cNvPr id="0" name="07_b3a.png"/>
                     <pic:cNvPicPr/>
                   </pic:nvPicPr>
                   <pic:blipFill>
@@ -3206,7 +3206,7 @@
                   <pic:spPr>
                     <a:xfrm>
                       <a:off x="0" y="0"/>
-                      <a:ext cx="5940000" cy="7178914"/>
+                      <a:ext cx="5940000" cy="5284286"/>
                     </a:xfrm>
                     <a:prstGeom prst="rect"/>
                   </pic:spPr>
@@ -3219,18 +3219,42 @@
     </w:p>
     <w:p>
       <w:pPr>
-        <w:keepNext/>
-        <w:spacing w:before="200" w:after="80"/>
-        <w:ind w:firstLine="709"/>
-        <w:jc w:val="left"/>
+        <w:spacing w:line="240" w:lineRule="auto" w:before="80" w:after="120"/>
+        <w:jc w:val="center"/>
       </w:pPr>
       <w:r>
-        <w:rPr>
-          <w:rFonts w:ascii="Times New Roman" w:hAnsi="Times New Roman"/>
-          <w:b/>
-          <w:sz w:val="28"/>
-        </w:rPr>
-        <w:t>4. Часть C. Функции и автоматизация списков</w:t>
+        <w:drawing>
+          <wp:inline xmlns:a="http://schemas.openxmlformats.org/drawingml/2006/main" xmlns:pic="http://schemas.openxmlformats.org/drawingml/2006/picture">
+            <wp:extent cx="5940000" cy="4636286"/>
+            <wp:docPr id="8" name="Picture 8"/>
+            <wp:cNvGraphicFramePr>
+              <a:graphicFrameLocks noChangeAspect="1"/>
+            </wp:cNvGraphicFramePr>
+            <a:graphic>
+              <a:graphicData uri="http://schemas.openxmlformats.org/drawingml/2006/picture">
+                <pic:pic>
+                  <pic:nvPicPr>
+                    <pic:cNvPr id="0" name="07_b3b.png"/>
+                    <pic:cNvPicPr/>
+                  </pic:nvPicPr>
+                  <pic:blipFill>
+                    <a:blip r:embed="rId16"/>
+                    <a:stretch>
+                      <a:fillRect/>
+                    </a:stretch>
+                  </pic:blipFill>
+                  <pic:spPr>
+                    <a:xfrm>
+                      <a:off x="0" y="0"/>
+                      <a:ext cx="5940000" cy="4636286"/>
+                    </a:xfrm>
+                    <a:prstGeom prst="rect"/>
+                  </pic:spPr>
+                </pic:pic>
+              </a:graphicData>
+            </a:graphic>
+          </wp:inline>
+        </w:drawing>
       </w:r>
     </w:p>
     <w:p>
@@ -3246,6 +3270,22 @@
           <w:b/>
           <w:sz w:val="28"/>
         </w:rPr>
+        <w:t>4. Часть C. Функции и автоматизация списков</w:t>
+      </w:r>
+    </w:p>
+    <w:p>
+      <w:pPr>
+        <w:keepNext/>
+        <w:spacing w:before="200" w:after="80"/>
+        <w:ind w:firstLine="709"/>
+        <w:jc w:val="left"/>
+      </w:pPr>
+      <w:r>
+        <w:rPr>
+          <w:rFonts w:ascii="Times New Roman" w:hAnsi="Times New Roman"/>
+          <w:b/>
+          <w:sz w:val="28"/>
+        </w:rPr>
         <w:t>4.1. Задание C1. wildcard и patsubst вместо ручного списка</w:t>
       </w:r>
     </w:p>
@@ -3348,8 +3388,8 @@
       <w:r>
         <w:drawing>
           <wp:inline xmlns:a="http://schemas.openxmlformats.org/drawingml/2006/main" xmlns:pic="http://schemas.openxmlformats.org/drawingml/2006/picture">
-            <wp:extent cx="5940000" cy="5012780"/>
-            <wp:docPr id="8" name="Picture 8"/>
+            <wp:extent cx="5940000" cy="3556286"/>
+            <wp:docPr id="9" name="Picture 9"/>
             <wp:cNvGraphicFramePr>
               <a:graphicFrameLocks noChangeAspect="1"/>
             </wp:cNvGraphicFramePr>
@@ -3361,7 +3401,7 @@
                     <pic:cNvPicPr/>
                   </pic:nvPicPr>
                   <pic:blipFill>
-                    <a:blip r:embed="rId16"/>
+                    <a:blip r:embed="rId17"/>
                     <a:stretch>
                       <a:fillRect/>
                     </a:stretch>
@@ -3369,7 +3409,7 @@
                   <pic:spPr>
                     <a:xfrm>
                       <a:off x="0" y="0"/>
-                      <a:ext cx="5940000" cy="5012780"/>
+                      <a:ext cx="5940000" cy="3556286"/>
                     </a:xfrm>
                     <a:prstGeom prst="rect"/>
                   </pic:spPr>
@@ -3507,8 +3547,8 @@
       <w:r>
         <w:drawing>
           <wp:inline xmlns:a="http://schemas.openxmlformats.org/drawingml/2006/main" xmlns:pic="http://schemas.openxmlformats.org/drawingml/2006/picture">
-            <wp:extent cx="5940000" cy="2824800"/>
-            <wp:docPr id="9" name="Picture 9"/>
+            <wp:extent cx="5940000" cy="3317914"/>
+            <wp:docPr id="10" name="Picture 10"/>
             <wp:cNvGraphicFramePr>
               <a:graphicFrameLocks noChangeAspect="1"/>
             </wp:cNvGraphicFramePr>
@@ -3520,7 +3560,7 @@
                     <pic:cNvPicPr/>
                   </pic:nvPicPr>
                   <pic:blipFill>
-                    <a:blip r:embed="rId17"/>
+                    <a:blip r:embed="rId18"/>
                     <a:stretch>
                       <a:fillRect/>
                     </a:stretch>
@@ -3528,7 +3568,7 @@
                   <pic:spPr>
                     <a:xfrm>
                       <a:off x="0" y="0"/>
-                      <a:ext cx="5940000" cy="2824800"/>
+                      <a:ext cx="5940000" cy="3317914"/>
                     </a:xfrm>
                     <a:prstGeom prst="rect"/>
                   </pic:spPr>
@@ -3611,8 +3651,8 @@
       <w:r>
         <w:drawing>
           <wp:inline xmlns:a="http://schemas.openxmlformats.org/drawingml/2006/main" xmlns:pic="http://schemas.openxmlformats.org/drawingml/2006/picture">
-            <wp:extent cx="5940000" cy="2698457"/>
-            <wp:docPr id="10" name="Picture 10"/>
+            <wp:extent cx="5940000" cy="3674314"/>
+            <wp:docPr id="11" name="Picture 11"/>
             <wp:cNvGraphicFramePr>
               <a:graphicFrameLocks noChangeAspect="1"/>
             </wp:cNvGraphicFramePr>
@@ -3624,7 +3664,7 @@
                     <pic:cNvPicPr/>
                   </pic:nvPicPr>
                   <pic:blipFill>
-                    <a:blip r:embed="rId18"/>
+                    <a:blip r:embed="rId19"/>
                     <a:stretch>
                       <a:fillRect/>
                     </a:stretch>
@@ -3632,7 +3672,7 @@
                   <pic:spPr>
                     <a:xfrm>
                       <a:off x="0" y="0"/>
-                      <a:ext cx="5940000" cy="2698457"/>
+                      <a:ext cx="5940000" cy="3674314"/>
                     </a:xfrm>
                     <a:prstGeom prst="rect"/>
                   </pic:spPr>
@@ -3785,8 +3825,8 @@
       <w:r>
         <w:drawing>
           <wp:inline xmlns:a="http://schemas.openxmlformats.org/drawingml/2006/main" xmlns:pic="http://schemas.openxmlformats.org/drawingml/2006/picture">
-            <wp:extent cx="5940000" cy="1578343"/>
-            <wp:docPr id="11" name="Picture 11"/>
+            <wp:extent cx="5940000" cy="2867278"/>
+            <wp:docPr id="12" name="Picture 12"/>
             <wp:cNvGraphicFramePr>
               <a:graphicFrameLocks noChangeAspect="1"/>
             </wp:cNvGraphicFramePr>
@@ -3798,7 +3838,7 @@
                     <pic:cNvPicPr/>
                   </pic:nvPicPr>
                   <pic:blipFill>
-                    <a:blip r:embed="rId19"/>
+                    <a:blip r:embed="rId20"/>
                     <a:stretch>
                       <a:fillRect/>
                     </a:stretch>
@@ -3806,7 +3846,7 @@
                   <pic:spPr>
                     <a:xfrm>
                       <a:off x="0" y="0"/>
-                      <a:ext cx="5940000" cy="1578343"/>
+                      <a:ext cx="5940000" cy="2867278"/>
                     </a:xfrm>
                     <a:prstGeom prst="rect"/>
                   </pic:spPr>
@@ -3917,8 +3957,8 @@
       <w:r>
         <w:drawing>
           <wp:inline xmlns:a="http://schemas.openxmlformats.org/drawingml/2006/main" xmlns:pic="http://schemas.openxmlformats.org/drawingml/2006/picture">
-            <wp:extent cx="5940000" cy="2130424"/>
-            <wp:docPr id="12" name="Picture 12"/>
+            <wp:extent cx="5940000" cy="3655929"/>
+            <wp:docPr id="13" name="Picture 13"/>
             <wp:cNvGraphicFramePr>
               <a:graphicFrameLocks noChangeAspect="1"/>
             </wp:cNvGraphicFramePr>
@@ -3930,7 +3970,7 @@
                     <pic:cNvPicPr/>
                   </pic:nvPicPr>
                   <pic:blipFill>
-                    <a:blip r:embed="rId20"/>
+                    <a:blip r:embed="rId21"/>
                     <a:stretch>
                       <a:fillRect/>
                     </a:stretch>
@@ -3938,7 +3978,7 @@
                   <pic:spPr>
                     <a:xfrm>
                       <a:off x="0" y="0"/>
-                      <a:ext cx="5940000" cy="2130424"/>
+                      <a:ext cx="5940000" cy="3655929"/>
                     </a:xfrm>
                     <a:prstGeom prst="rect"/>
                   </pic:spPr>
@@ -4001,8 +4041,8 @@
       <w:r>
         <w:drawing>
           <wp:inline xmlns:a="http://schemas.openxmlformats.org/drawingml/2006/main" xmlns:pic="http://schemas.openxmlformats.org/drawingml/2006/picture">
-            <wp:extent cx="5940000" cy="962609"/>
-            <wp:docPr id="13" name="Picture 13"/>
+            <wp:extent cx="5940000" cy="2216893"/>
+            <wp:docPr id="14" name="Picture 14"/>
             <wp:cNvGraphicFramePr>
               <a:graphicFrameLocks noChangeAspect="1"/>
             </wp:cNvGraphicFramePr>
@@ -4014,7 +4054,7 @@
                     <pic:cNvPicPr/>
                   </pic:nvPicPr>
                   <pic:blipFill>
-                    <a:blip r:embed="rId21"/>
+                    <a:blip r:embed="rId22"/>
                     <a:stretch>
                       <a:fillRect/>
                     </a:stretch>
@@ -4022,7 +4062,7 @@
                   <pic:spPr>
                     <a:xfrm>
                       <a:off x="0" y="0"/>
-                      <a:ext cx="5940000" cy="962609"/>
+                      <a:ext cx="5940000" cy="2216893"/>
                     </a:xfrm>
                     <a:prstGeom prst="rect"/>
                   </pic:spPr>
@@ -4085,8 +4125,8 @@
       <w:r>
         <w:drawing>
           <wp:inline xmlns:a="http://schemas.openxmlformats.org/drawingml/2006/main" xmlns:pic="http://schemas.openxmlformats.org/drawingml/2006/picture">
-            <wp:extent cx="5940000" cy="1102683"/>
-            <wp:docPr id="14" name="Picture 14"/>
+            <wp:extent cx="5940000" cy="3129531"/>
+            <wp:docPr id="15" name="Picture 15"/>
             <wp:cNvGraphicFramePr>
               <a:graphicFrameLocks noChangeAspect="1"/>
             </wp:cNvGraphicFramePr>
@@ -4098,7 +4138,7 @@
                     <pic:cNvPicPr/>
                   </pic:nvPicPr>
                   <pic:blipFill>
-                    <a:blip r:embed="rId22"/>
+                    <a:blip r:embed="rId23"/>
                     <a:stretch>
                       <a:fillRect/>
                     </a:stretch>
@@ -4106,7 +4146,7 @@
                   <pic:spPr>
                     <a:xfrm>
                       <a:off x="0" y="0"/>
-                      <a:ext cx="5940000" cy="1102683"/>
+                      <a:ext cx="5940000" cy="3129531"/>
                     </a:xfrm>
                     <a:prstGeom prst="rect"/>
                   </pic:spPr>
@@ -4500,8 +4540,8 @@
       <w:r>
         <w:drawing>
           <wp:inline xmlns:a="http://schemas.openxmlformats.org/drawingml/2006/main" xmlns:pic="http://schemas.openxmlformats.org/drawingml/2006/picture">
-            <wp:extent cx="5940000" cy="2899565"/>
-            <wp:docPr id="15" name="Picture 15"/>
+            <wp:extent cx="5940000" cy="2933633"/>
+            <wp:docPr id="16" name="Picture 16"/>
             <wp:cNvGraphicFramePr>
               <a:graphicFrameLocks noChangeAspect="1"/>
             </wp:cNvGraphicFramePr>
@@ -4513,7 +4553,7 @@
                     <pic:cNvPicPr/>
                   </pic:nvPicPr>
                   <pic:blipFill>
-                    <a:blip r:embed="rId23"/>
+                    <a:blip r:embed="rId24"/>
                     <a:stretch>
                       <a:fillRect/>
                     </a:stretch>
@@ -4521,7 +4561,7 @@
                   <pic:spPr>
                     <a:xfrm>
                       <a:off x="0" y="0"/>
-                      <a:ext cx="5940000" cy="2899565"/>
+                      <a:ext cx="5940000" cy="2933633"/>
                     </a:xfrm>
                     <a:prstGeom prst="rect"/>
                   </pic:spPr>
@@ -5491,8 +5531,8 @@
       <w:r>
         <w:drawing>
           <wp:inline xmlns:a="http://schemas.openxmlformats.org/drawingml/2006/main" xmlns:pic="http://schemas.openxmlformats.org/drawingml/2006/picture">
-            <wp:extent cx="5940000" cy="1995652"/>
-            <wp:docPr id="16" name="Picture 16"/>
+            <wp:extent cx="5940000" cy="3853929"/>
+            <wp:docPr id="17" name="Picture 17"/>
             <wp:cNvGraphicFramePr>
               <a:graphicFrameLocks noChangeAspect="1"/>
             </wp:cNvGraphicFramePr>
@@ -5504,7 +5544,7 @@
                     <pic:cNvPicPr/>
                   </pic:nvPicPr>
                   <pic:blipFill>
-                    <a:blip r:embed="rId24"/>
+                    <a:blip r:embed="rId25"/>
                     <a:stretch>
                       <a:fillRect/>
                     </a:stretch>
@@ -5512,7 +5552,7 @@
                   <pic:spPr>
                     <a:xfrm>
                       <a:off x="0" y="0"/>
-                      <a:ext cx="5940000" cy="1995652"/>
+                      <a:ext cx="5940000" cy="3853929"/>
                     </a:xfrm>
                     <a:prstGeom prst="rect"/>
                   </pic:spPr>
@@ -5531,8 +5571,8 @@
       <w:r>
         <w:drawing>
           <wp:inline xmlns:a="http://schemas.openxmlformats.org/drawingml/2006/main" xmlns:pic="http://schemas.openxmlformats.org/drawingml/2006/picture">
-            <wp:extent cx="5940000" cy="3028696"/>
-            <wp:docPr id="17" name="Picture 17"/>
+            <wp:extent cx="5940000" cy="5239929"/>
+            <wp:docPr id="18" name="Picture 18"/>
             <wp:cNvGraphicFramePr>
               <a:graphicFrameLocks noChangeAspect="1"/>
             </wp:cNvGraphicFramePr>
@@ -5544,7 +5584,7 @@
                     <pic:cNvPicPr/>
                   </pic:nvPicPr>
                   <pic:blipFill>
-                    <a:blip r:embed="rId25"/>
+                    <a:blip r:embed="rId26"/>
                     <a:stretch>
                       <a:fillRect/>
                     </a:stretch>
@@ -5552,7 +5592,7 @@
                   <pic:spPr>
                     <a:xfrm>
                       <a:off x="0" y="0"/>
-                      <a:ext cx="5940000" cy="3028696"/>
+                      <a:ext cx="5940000" cy="5239929"/>
                     </a:xfrm>
                     <a:prstGeom prst="rect"/>
                   </pic:spPr>
@@ -5601,8 +5641,8 @@
       <w:r>
         <w:drawing>
           <wp:inline xmlns:a="http://schemas.openxmlformats.org/drawingml/2006/main" xmlns:pic="http://schemas.openxmlformats.org/drawingml/2006/picture">
-            <wp:extent cx="5940000" cy="1737391"/>
-            <wp:docPr id="18" name="Picture 18"/>
+            <wp:extent cx="5940000" cy="4645929"/>
+            <wp:docPr id="19" name="Picture 19"/>
             <wp:cNvGraphicFramePr>
               <a:graphicFrameLocks noChangeAspect="1"/>
             </wp:cNvGraphicFramePr>
@@ -5614,7 +5654,7 @@
                     <pic:cNvPicPr/>
                   </pic:nvPicPr>
                   <pic:blipFill>
-                    <a:blip r:embed="rId26"/>
+                    <a:blip r:embed="rId27"/>
                     <a:stretch>
                       <a:fillRect/>
                     </a:stretch>
@@ -5622,7 +5662,7 @@
                   <pic:spPr>
                     <a:xfrm>
                       <a:off x="0" y="0"/>
-                      <a:ext cx="5940000" cy="1737391"/>
+                      <a:ext cx="5940000" cy="4645929"/>
                     </a:xfrm>
                     <a:prstGeom prst="rect"/>
                   </pic:spPr>
@@ -5655,8 +5695,8 @@
       <w:r>
         <w:drawing>
           <wp:inline xmlns:a="http://schemas.openxmlformats.org/drawingml/2006/main" xmlns:pic="http://schemas.openxmlformats.org/drawingml/2006/picture">
-            <wp:extent cx="5940000" cy="1006780"/>
-            <wp:docPr id="19" name="Picture 19"/>
+            <wp:extent cx="5940000" cy="4843929"/>
+            <wp:docPr id="20" name="Picture 20"/>
             <wp:cNvGraphicFramePr>
               <a:graphicFrameLocks noChangeAspect="1"/>
             </wp:cNvGraphicFramePr>
@@ -5668,7 +5708,7 @@
                     <pic:cNvPicPr/>
                   </pic:nvPicPr>
                   <pic:blipFill>
-                    <a:blip r:embed="rId27"/>
+                    <a:blip r:embed="rId28"/>
                     <a:stretch>
                       <a:fillRect/>
                     </a:stretch>
@@ -5676,7 +5716,7 @@
                   <pic:spPr>
                     <a:xfrm>
                       <a:off x="0" y="0"/>
-                      <a:ext cx="5940000" cy="1006780"/>
+                      <a:ext cx="5940000" cy="4843929"/>
                     </a:xfrm>
                     <a:prstGeom prst="rect"/>
                   </pic:spPr>
@@ -5762,7 +5802,7 @@
           <w:sz w:val="20"/>
         </w:rPr>
         <w:tab/>
-        <w:t>@echo "Доступные цели:"</w:t>
+        <w:t>@echo "Available targets:"</w:t>
         <w:br/>
       </w:r>
       <w:r>
@@ -5782,8 +5822,8 @@
       <w:r>
         <w:drawing>
           <wp:inline xmlns:a="http://schemas.openxmlformats.org/drawingml/2006/main" xmlns:pic="http://schemas.openxmlformats.org/drawingml/2006/picture">
-            <wp:extent cx="5940000" cy="2885143"/>
-            <wp:docPr id="20" name="Picture 20"/>
+            <wp:extent cx="5940000" cy="3436714"/>
+            <wp:docPr id="21" name="Picture 21"/>
             <wp:cNvGraphicFramePr>
               <a:graphicFrameLocks noChangeAspect="1"/>
             </wp:cNvGraphicFramePr>
@@ -5795,7 +5835,7 @@
                     <pic:cNvPicPr/>
                   </pic:nvPicPr>
                   <pic:blipFill>
-                    <a:blip r:embed="rId28"/>
+                    <a:blip r:embed="rId29"/>
                     <a:stretch>
                       <a:fillRect/>
                     </a:stretch>
@@ -5803,7 +5843,7 @@
                   <pic:spPr>
                     <a:xfrm>
                       <a:off x="0" y="0"/>
-                      <a:ext cx="5940000" cy="2885143"/>
+                      <a:ext cx="5940000" cy="3436714"/>
                     </a:xfrm>
                     <a:prstGeom prst="rect"/>
                   </pic:spPr>
@@ -5941,8 +5981,8 @@
       <w:r>
         <w:drawing>
           <wp:inline xmlns:a="http://schemas.openxmlformats.org/drawingml/2006/main" xmlns:pic="http://schemas.openxmlformats.org/drawingml/2006/picture">
-            <wp:extent cx="5940000" cy="1536716"/>
-            <wp:docPr id="21" name="Picture 21"/>
+            <wp:extent cx="5940000" cy="2665929"/>
+            <wp:docPr id="22" name="Picture 22"/>
             <wp:cNvGraphicFramePr>
               <a:graphicFrameLocks noChangeAspect="1"/>
             </wp:cNvGraphicFramePr>
@@ -5954,7 +5994,7 @@
                     <pic:cNvPicPr/>
                   </pic:nvPicPr>
                   <pic:blipFill>
-                    <a:blip r:embed="rId29"/>
+                    <a:blip r:embed="rId30"/>
                     <a:stretch>
                       <a:fillRect/>
                     </a:stretch>
@@ -5962,7 +6002,7 @@
                   <pic:spPr>
                     <a:xfrm>
                       <a:off x="0" y="0"/>
-                      <a:ext cx="5940000" cy="1536716"/>
+                      <a:ext cx="5940000" cy="2665929"/>
                     </a:xfrm>
                     <a:prstGeom prst="rect"/>
                   </pic:spPr>
@@ -5981,8 +6021,8 @@
       <w:r>
         <w:drawing>
           <wp:inline xmlns:a="http://schemas.openxmlformats.org/drawingml/2006/main" xmlns:pic="http://schemas.openxmlformats.org/drawingml/2006/picture">
-            <wp:extent cx="5940000" cy="3578488"/>
-            <wp:docPr id="22" name="Picture 22"/>
+            <wp:extent cx="5940000" cy="2962928"/>
+            <wp:docPr id="23" name="Picture 23"/>
             <wp:cNvGraphicFramePr>
               <a:graphicFrameLocks noChangeAspect="1"/>
             </wp:cNvGraphicFramePr>
@@ -5994,7 +6034,7 @@
                     <pic:cNvPicPr/>
                   </pic:nvPicPr>
                   <pic:blipFill>
-                    <a:blip r:embed="rId30"/>
+                    <a:blip r:embed="rId31"/>
                     <a:stretch>
                       <a:fillRect/>
                     </a:stretch>
@@ -6002,7 +6042,7 @@
                   <pic:spPr>
                     <a:xfrm>
                       <a:off x="0" y="0"/>
-                      <a:ext cx="5940000" cy="3578488"/>
+                      <a:ext cx="5940000" cy="2962928"/>
                     </a:xfrm>
                     <a:prstGeom prst="rect"/>
                   </pic:spPr>
@@ -6065,8 +6105,8 @@
       <w:r>
         <w:drawing>
           <wp:inline xmlns:a="http://schemas.openxmlformats.org/drawingml/2006/main" xmlns:pic="http://schemas.openxmlformats.org/drawingml/2006/picture">
-            <wp:extent cx="5940000" cy="5094783"/>
-            <wp:docPr id="23" name="Picture 23"/>
+            <wp:extent cx="5940000" cy="5734928"/>
+            <wp:docPr id="24" name="Picture 24"/>
             <wp:cNvGraphicFramePr>
               <a:graphicFrameLocks noChangeAspect="1"/>
             </wp:cNvGraphicFramePr>
@@ -6078,7 +6118,7 @@
                     <pic:cNvPicPr/>
                   </pic:nvPicPr>
                   <pic:blipFill>
-                    <a:blip r:embed="rId31"/>
+                    <a:blip r:embed="rId32"/>
                     <a:stretch>
                       <a:fillRect/>
                     </a:stretch>
@@ -6086,7 +6126,7 @@
                   <pic:spPr>
                     <a:xfrm>
                       <a:off x="0" y="0"/>
-                      <a:ext cx="5940000" cy="5094783"/>
+                      <a:ext cx="5940000" cy="5734928"/>
                     </a:xfrm>
                     <a:prstGeom prst="rect"/>
                   </pic:spPr>
@@ -6133,8 +6173,8 @@
       <w:r>
         <w:drawing>
           <wp:inline xmlns:a="http://schemas.openxmlformats.org/drawingml/2006/main" xmlns:pic="http://schemas.openxmlformats.org/drawingml/2006/picture">
-            <wp:extent cx="5940000" cy="3436143"/>
-            <wp:docPr id="24" name="Picture 24"/>
+            <wp:extent cx="5940000" cy="5734928"/>
+            <wp:docPr id="25" name="Picture 25"/>
             <wp:cNvGraphicFramePr>
               <a:graphicFrameLocks noChangeAspect="1"/>
             </wp:cNvGraphicFramePr>
@@ -6146,7 +6186,7 @@
                     <pic:cNvPicPr/>
                   </pic:nvPicPr>
                   <pic:blipFill>
-                    <a:blip r:embed="rId32"/>
+                    <a:blip r:embed="rId33"/>
                     <a:stretch>
                       <a:fillRect/>
                     </a:stretch>
@@ -6154,7 +6194,7 @@
                   <pic:spPr>
                     <a:xfrm>
                       <a:off x="0" y="0"/>
-                      <a:ext cx="5940000" cy="3436143"/>
+                      <a:ext cx="5940000" cy="5734928"/>
                     </a:xfrm>
                     <a:prstGeom prst="rect"/>
                   </pic:spPr>
@@ -6217,8 +6257,8 @@
       <w:r>
         <w:drawing>
           <wp:inline xmlns:a="http://schemas.openxmlformats.org/drawingml/2006/main" xmlns:pic="http://schemas.openxmlformats.org/drawingml/2006/picture">
-            <wp:extent cx="5940000" cy="997920"/>
-            <wp:docPr id="25" name="Picture 25"/>
+            <wp:extent cx="5940000" cy="2071929"/>
+            <wp:docPr id="26" name="Picture 26"/>
             <wp:cNvGraphicFramePr>
               <a:graphicFrameLocks noChangeAspect="1"/>
             </wp:cNvGraphicFramePr>
@@ -6230,7 +6270,7 @@
                     <pic:cNvPicPr/>
                   </pic:nvPicPr>
                   <pic:blipFill>
-                    <a:blip r:embed="rId33"/>
+                    <a:blip r:embed="rId34"/>
                     <a:stretch>
                       <a:fillRect/>
                     </a:stretch>
@@ -6238,7 +6278,7 @@
                   <pic:spPr>
                     <a:xfrm>
                       <a:off x="0" y="0"/>
-                      <a:ext cx="5940000" cy="997920"/>
+                      <a:ext cx="5940000" cy="2071929"/>
                     </a:xfrm>
                     <a:prstGeom prst="rect"/>
                   </pic:spPr>
@@ -6271,8 +6311,8 @@
       <w:r>
         <w:drawing>
           <wp:inline xmlns:a="http://schemas.openxmlformats.org/drawingml/2006/main" xmlns:pic="http://schemas.openxmlformats.org/drawingml/2006/picture">
-            <wp:extent cx="5940000" cy="831600"/>
-            <wp:docPr id="26" name="Picture 26"/>
+            <wp:extent cx="5940000" cy="2429472"/>
+            <wp:docPr id="27" name="Picture 27"/>
             <wp:cNvGraphicFramePr>
               <a:graphicFrameLocks noChangeAspect="1"/>
             </wp:cNvGraphicFramePr>
@@ -6284,7 +6324,7 @@
                     <pic:cNvPicPr/>
                   </pic:nvPicPr>
                   <pic:blipFill>
-                    <a:blip r:embed="rId34"/>
+                    <a:blip r:embed="rId35"/>
                     <a:stretch>
                       <a:fillRect/>
                     </a:stretch>
@@ -6292,7 +6332,7 @@
                   <pic:spPr>
                     <a:xfrm>
                       <a:off x="0" y="0"/>
-                      <a:ext cx="5940000" cy="831600"/>
+                      <a:ext cx="5940000" cy="2429472"/>
                     </a:xfrm>
                     <a:prstGeom prst="rect"/>
                   </pic:spPr>
@@ -6341,8 +6381,8 @@
       <w:r>
         <w:drawing>
           <wp:inline xmlns:a="http://schemas.openxmlformats.org/drawingml/2006/main" xmlns:pic="http://schemas.openxmlformats.org/drawingml/2006/picture">
-            <wp:extent cx="5940000" cy="2304720"/>
-            <wp:docPr id="27" name="Picture 27"/>
+            <wp:extent cx="5940000" cy="4840251"/>
+            <wp:docPr id="28" name="Picture 28"/>
             <wp:cNvGraphicFramePr>
               <a:graphicFrameLocks noChangeAspect="1"/>
             </wp:cNvGraphicFramePr>
@@ -6354,7 +6394,7 @@
                     <pic:cNvPicPr/>
                   </pic:nvPicPr>
                   <pic:blipFill>
-                    <a:blip r:embed="rId35"/>
+                    <a:blip r:embed="rId36"/>
                     <a:stretch>
                       <a:fillRect/>
                     </a:stretch>
@@ -6362,7 +6402,7 @@
                   <pic:spPr>
                     <a:xfrm>
                       <a:off x="0" y="0"/>
-                      <a:ext cx="5940000" cy="2304720"/>
+                      <a:ext cx="5940000" cy="4840251"/>
                     </a:xfrm>
                     <a:prstGeom prst="rect"/>
                   </pic:spPr>
@@ -6409,8 +6449,8 @@
       <w:r>
         <w:drawing>
           <wp:inline xmlns:a="http://schemas.openxmlformats.org/drawingml/2006/main" xmlns:pic="http://schemas.openxmlformats.org/drawingml/2006/picture">
-            <wp:extent cx="5940000" cy="736560"/>
-            <wp:docPr id="28" name="Picture 28"/>
+            <wp:extent cx="5940000" cy="5239929"/>
+            <wp:docPr id="29" name="Picture 29"/>
             <wp:cNvGraphicFramePr>
               <a:graphicFrameLocks noChangeAspect="1"/>
             </wp:cNvGraphicFramePr>
@@ -6422,7 +6462,7 @@
                     <pic:cNvPicPr/>
                   </pic:nvPicPr>
                   <pic:blipFill>
-                    <a:blip r:embed="rId36"/>
+                    <a:blip r:embed="rId37"/>
                     <a:stretch>
                       <a:fillRect/>
                     </a:stretch>
@@ -6430,7 +6470,7 @@
                   <pic:spPr>
                     <a:xfrm>
                       <a:off x="0" y="0"/>
-                      <a:ext cx="5940000" cy="736560"/>
+                      <a:ext cx="5940000" cy="5239929"/>
                     </a:xfrm>
                     <a:prstGeom prst="rect"/>
                   </pic:spPr>
@@ -6550,8 +6590,8 @@
       <w:r>
         <w:drawing>
           <wp:inline xmlns:a="http://schemas.openxmlformats.org/drawingml/2006/main" xmlns:pic="http://schemas.openxmlformats.org/drawingml/2006/picture">
-            <wp:extent cx="5940000" cy="7365600"/>
-            <wp:docPr id="29" name="Picture 29"/>
+            <wp:extent cx="5940000" cy="5309633"/>
+            <wp:docPr id="30" name="Picture 30"/>
             <wp:cNvGraphicFramePr>
               <a:graphicFrameLocks noChangeAspect="1"/>
             </wp:cNvGraphicFramePr>
@@ -6563,7 +6603,7 @@
                     <pic:cNvPicPr/>
                   </pic:nvPicPr>
                   <pic:blipFill>
-                    <a:blip r:embed="rId37"/>
+                    <a:blip r:embed="rId38"/>
                     <a:stretch>
                       <a:fillRect/>
                     </a:stretch>
@@ -6571,7 +6611,7 @@
                   <pic:spPr>
                     <a:xfrm>
                       <a:off x="0" y="0"/>
-                      <a:ext cx="5940000" cy="7365600"/>
+                      <a:ext cx="5940000" cy="5309633"/>
                     </a:xfrm>
                     <a:prstGeom prst="rect"/>
                   </pic:spPr>
@@ -6604,8 +6644,8 @@
       <w:r>
         <w:drawing>
           <wp:inline xmlns:a="http://schemas.openxmlformats.org/drawingml/2006/main" xmlns:pic="http://schemas.openxmlformats.org/drawingml/2006/picture">
-            <wp:extent cx="5940000" cy="831600"/>
-            <wp:docPr id="30" name="Picture 30"/>
+            <wp:extent cx="5940000" cy="2617173"/>
+            <wp:docPr id="31" name="Picture 31"/>
             <wp:cNvGraphicFramePr>
               <a:graphicFrameLocks noChangeAspect="1"/>
             </wp:cNvGraphicFramePr>
@@ -6617,7 +6657,7 @@
                     <pic:cNvPicPr/>
                   </pic:nvPicPr>
                   <pic:blipFill>
-                    <a:blip r:embed="rId38"/>
+                    <a:blip r:embed="rId39"/>
                     <a:stretch>
                       <a:fillRect/>
                     </a:stretch>
@@ -6625,7 +6665,7 @@
                   <pic:spPr>
                     <a:xfrm>
                       <a:off x="0" y="0"/>
-                      <a:ext cx="5940000" cy="831600"/>
+                      <a:ext cx="5940000" cy="2617173"/>
                     </a:xfrm>
                     <a:prstGeom prst="rect"/>
                   </pic:spPr>
@@ -9009,7 +9049,7 @@
           <w:sz w:val="18"/>
         </w:rPr>
         <w:tab/>
-        <w:t>@echo "Доступные цели:"</w:t>
+        <w:t>@echo "Available targets:"</w:t>
         <w:br/>
       </w:r>
       <w:r>
@@ -9080,8 +9120,8 @@
       <w:r>
         <w:drawing>
           <wp:inline xmlns:a="http://schemas.openxmlformats.org/drawingml/2006/main" xmlns:pic="http://schemas.openxmlformats.org/drawingml/2006/picture">
-            <wp:extent cx="5940000" cy="3263241"/>
-            <wp:docPr id="31" name="Picture 31"/>
+            <wp:extent cx="5940000" cy="5239929"/>
+            <wp:docPr id="32" name="Picture 32"/>
             <wp:cNvGraphicFramePr>
               <a:graphicFrameLocks noChangeAspect="1"/>
             </wp:cNvGraphicFramePr>
@@ -9093,7 +9133,7 @@
                     <pic:cNvPicPr/>
                   </pic:nvPicPr>
                   <pic:blipFill>
-                    <a:blip r:embed="rId39"/>
+                    <a:blip r:embed="rId40"/>
                     <a:stretch>
                       <a:fillRect/>
                     </a:stretch>
@@ -9101,7 +9141,7 @@
                   <pic:spPr>
                     <a:xfrm>
                       <a:off x="0" y="0"/>
-                      <a:ext cx="5940000" cy="3263241"/>
+                      <a:ext cx="5940000" cy="5239929"/>
                     </a:xfrm>
                     <a:prstGeom prst="rect"/>
                   </pic:spPr>

</xml_diff>